<commit_message>
docs: SAD v1.1 - align data model, version API and layout with implementation
</commit_message>
<xml_diff>
--- a/docs/SAD_Shared_Whiteboard.docx
+++ b/docs/SAD_Shared_Whiteboard.docx
@@ -61,7 +61,7 @@
           <w:sz w:val="20"/>
           <w:szCs w:val="20"/>
         </w:rPr>
-        <w:t xml:space="preserve">1.0</w:t>
+        <w:t xml:space="preserve">1.1</w:t>
       </w:r>
     </w:p>
     <w:p>
@@ -192,7 +192,7 @@
           <w:sz w:val="20"/>
           <w:szCs w:val="20"/>
         </w:rPr>
-        <w:t xml:space="preserve">10-10-2026</w:t>
+        <w:t xml:space="preserve">27-10-2026</w:t>
       </w:r>
     </w:p>
     <w:p>
@@ -555,6 +555,156 @@
           </w:p>
         </w:tc>
       </w:tr>
+      <w:tr>
+        <w:trPr>
+          <w:cantSplit/>
+        </w:trPr>
+        <w:tc>
+          <w:tcPr>
+            <w:tcW w:type="dxa" w:w="900"/>
+            <w:tcBorders>
+              <w:top w:val="single" w:color="999999" w:sz="4"/>
+              <w:left w:val="single" w:color="999999" w:sz="4"/>
+              <w:bottom w:val="single" w:color="999999" w:sz="4"/>
+              <w:right w:val="single" w:color="999999" w:sz="4"/>
+            </w:tcBorders>
+            <w:tcMar>
+              <w:top w:type="dxa" w:w="50"/>
+              <w:left w:type="dxa" w:w="80"/>
+              <w:bottom w:type="dxa" w:w="50"/>
+              <w:right w:type="dxa" w:w="80"/>
+            </w:tcMar>
+          </w:tcPr>
+          <w:p>
+            <w:r>
+              <w:rPr>
+                <w:rFonts w:ascii="Arial" w:cs="Arial" w:eastAsia="Arial" w:hAnsi="Arial"/>
+                <w:b w:val="false"/>
+                <w:bCs w:val="false"/>
+                <w:sz w:val="16"/>
+                <w:szCs w:val="16"/>
+              </w:rPr>
+              <w:t xml:space="preserve">1.1</w:t>
+            </w:r>
+          </w:p>
+        </w:tc>
+        <w:tc>
+          <w:tcPr>
+            <w:tcW w:type="dxa" w:w="1300"/>
+            <w:tcBorders>
+              <w:top w:val="single" w:color="999999" w:sz="4"/>
+              <w:left w:val="single" w:color="999999" w:sz="4"/>
+              <w:bottom w:val="single" w:color="999999" w:sz="4"/>
+              <w:right w:val="single" w:color="999999" w:sz="4"/>
+            </w:tcBorders>
+            <w:tcMar>
+              <w:top w:type="dxa" w:w="50"/>
+              <w:left w:type="dxa" w:w="80"/>
+              <w:bottom w:type="dxa" w:w="50"/>
+              <w:right w:type="dxa" w:w="80"/>
+            </w:tcMar>
+          </w:tcPr>
+          <w:p>
+            <w:r>
+              <w:rPr>
+                <w:rFonts w:ascii="Arial" w:cs="Arial" w:eastAsia="Arial" w:hAnsi="Arial"/>
+                <w:b w:val="false"/>
+                <w:bCs w:val="false"/>
+                <w:sz w:val="16"/>
+                <w:szCs w:val="16"/>
+              </w:rPr>
+              <w:t xml:space="preserve">27-10-2026</w:t>
+            </w:r>
+          </w:p>
+        </w:tc>
+        <w:tc>
+          <w:tcPr>
+            <w:tcW w:type="dxa" w:w="2200"/>
+            <w:tcBorders>
+              <w:top w:val="single" w:color="999999" w:sz="4"/>
+              <w:left w:val="single" w:color="999999" w:sz="4"/>
+              <w:bottom w:val="single" w:color="999999" w:sz="4"/>
+              <w:right w:val="single" w:color="999999" w:sz="4"/>
+            </w:tcBorders>
+            <w:tcMar>
+              <w:top w:type="dxa" w:w="50"/>
+              <w:left w:type="dxa" w:w="80"/>
+              <w:bottom w:type="dxa" w:w="50"/>
+              <w:right w:type="dxa" w:w="80"/>
+            </w:tcMar>
+          </w:tcPr>
+          <w:p>
+            <w:r>
+              <w:rPr>
+                <w:rFonts w:ascii="Arial" w:cs="Arial" w:eastAsia="Arial" w:hAnsi="Arial"/>
+                <w:b w:val="false"/>
+                <w:bCs w:val="false"/>
+                <w:sz w:val="16"/>
+                <w:szCs w:val="16"/>
+              </w:rPr>
+              <w:t xml:space="preserve">Sriviswaja M</w:t>
+            </w:r>
+          </w:p>
+        </w:tc>
+        <w:tc>
+          <w:tcPr>
+            <w:tcW w:type="dxa" w:w="4006"/>
+            <w:tcBorders>
+              <w:top w:val="single" w:color="999999" w:sz="4"/>
+              <w:left w:val="single" w:color="999999" w:sz="4"/>
+              <w:bottom w:val="single" w:color="999999" w:sz="4"/>
+              <w:right w:val="single" w:color="999999" w:sz="4"/>
+            </w:tcBorders>
+            <w:tcMar>
+              <w:top w:type="dxa" w:w="50"/>
+              <w:left w:type="dxa" w:w="80"/>
+              <w:bottom w:type="dxa" w:w="50"/>
+              <w:right w:type="dxa" w:w="80"/>
+            </w:tcMar>
+          </w:tcPr>
+          <w:p>
+            <w:r>
+              <w:rPr>
+                <w:rFonts w:ascii="Arial" w:cs="Arial" w:eastAsia="Arial" w:hAnsi="Arial"/>
+                <w:b w:val="false"/>
+                <w:bCs w:val="false"/>
+                <w:sz w:val="16"/>
+                <w:szCs w:val="16"/>
+              </w:rPr>
+              <w:t xml:space="preserve">Data model, version API, retention rule and code layout aligned with the implementation; ER diagram redrawn</w:t>
+            </w:r>
+          </w:p>
+        </w:tc>
+        <w:tc>
+          <w:tcPr>
+            <w:tcW w:type="dxa" w:w="1700"/>
+            <w:tcBorders>
+              <w:top w:val="single" w:color="999999" w:sz="4"/>
+              <w:left w:val="single" w:color="999999" w:sz="4"/>
+              <w:bottom w:val="single" w:color="999999" w:sz="4"/>
+              <w:right w:val="single" w:color="999999" w:sz="4"/>
+            </w:tcBorders>
+            <w:tcMar>
+              <w:top w:type="dxa" w:w="50"/>
+              <w:left w:type="dxa" w:w="80"/>
+              <w:bottom w:type="dxa" w:w="50"/>
+              <w:right w:type="dxa" w:w="80"/>
+            </w:tcMar>
+          </w:tcPr>
+          <w:p>
+            <w:r>
+              <w:rPr>
+                <w:rFonts w:ascii="Arial" w:cs="Arial" w:eastAsia="Arial" w:hAnsi="Arial"/>
+                <w:b w:val="false"/>
+                <w:bCs w:val="false"/>
+                <w:sz w:val="16"/>
+                <w:szCs w:val="16"/>
+              </w:rPr>
+              <w:t xml:space="preserve"/>
+            </w:r>
+          </w:p>
+        </w:tc>
+      </w:tr>
     </w:tbl>
     <w:p>
       <w:pPr>
@@ -2306,7 +2456,7 @@
           <w:sz w:val="20"/>
           <w:szCs w:val="20"/>
         </w:rPr>
-        <w:t xml:space="preserve">Shared Whiteboard Software Test Plan (STP) v1.0 (to be written)</w:t>
+        <w:t xml:space="preserve">Shared Whiteboard Software Test Plan (STP) v1.0</w:t>
       </w:r>
     </w:p>
     <w:p>
@@ -4091,7 +4241,7 @@
                 <w:sz w:val="16"/>
                 <w:szCs w:val="16"/>
               </w:rPr>
-              <w:t xml:space="preserve">Versions table and retention limit; REST list endpoint</w:t>
+              <w:t xml:space="preserve">Snapshots table and 50-snapshot retention; REST list endpoint</w:t>
             </w:r>
           </w:p>
         </w:tc>
@@ -7024,7 +7174,7 @@
                 <w:sz w:val="16"/>
                 <w:szCs w:val="16"/>
               </w:rPr>
-              <w:t xml:space="preserve">Stores boards, objects, the operation log, versions and the audit log.</w:t>
+              <w:t xml:space="preserve">Stores boards, the operation log, snapshots (versions) and the audit log.</w:t>
             </w:r>
           </w:p>
         </w:tc>
@@ -7856,7 +8006,7 @@
                 <w:sz w:val="16"/>
                 <w:szCs w:val="16"/>
               </w:rPr>
-              <w:t xml:space="preserve">Boards, current objects, append-only operation log, version snapshots, audit log.</w:t>
+              <w:t xml:space="preserve">Boards, append-only operation log, snapshots (versions), audit log. Current objects are rebuilt from the latest snapshot plus later operations.</w:t>
             </w:r>
           </w:p>
         </w:tc>
@@ -8983,7 +9133,7 @@
           <w:sz w:val="18"/>
           <w:szCs w:val="18"/>
         </w:rPr>
-        <w:t xml:space="preserve">8. Version Service loads the snapshot and appends a new version "restored from vN" plus an audit entry (nothing is deleted).</w:t>
+        <w:t xml:space="preserve">8. Version Service loads the snapshot and saves its state as a new version "Restored from version N" plus an audit entry (nothing is deleted).</w:t>
       </w:r>
     </w:p>
     <w:p>
@@ -9296,7 +9446,7 @@
                 <w:sz w:val="16"/>
                 <w:szCs w:val="16"/>
               </w:rPr>
-              <w:t xml:space="preserve">boardId (128-bit random token), createdAt, lastActivityAt, lastSeq</w:t>
+              <w:t xml:space="preserve">boardId (128-bit random token), name, createdAt</w:t>
             </w:r>
           </w:p>
         </w:tc>
@@ -9325,7 +9475,7 @@
                 <w:sz w:val="16"/>
                 <w:szCs w:val="16"/>
               </w:rPr>
-              <w:t xml:space="preserve">One row per board. The boardId is the access secret. A board has many elements, operations, versions and audit entries.</w:t>
+              <w:t xml:space="preserve">One row per board. The boardId is the access secret. A board has many operations, snapshots and audit entries. Its latest sequence number is the highest seq in its operation log.</w:t>
             </w:r>
           </w:p>
         </w:tc>
@@ -9359,7 +9509,7 @@
                 <w:sz w:val="16"/>
                 <w:szCs w:val="16"/>
               </w:rPr>
-              <w:t xml:space="preserve">Element</w:t>
+              <w:t xml:space="preserve">Board state (derived)</w:t>
             </w:r>
           </w:p>
         </w:tc>
@@ -9388,7 +9538,7 @@
                 <w:sz w:val="16"/>
                 <w:szCs w:val="16"/>
               </w:rPr>
-              <w:t xml:space="preserve">boardId + objectId, type, props, z, updatedSeq, updatedBy, deleted</w:t>
+              <w:t xml:space="preserve">objectId to properties map (not a table)</w:t>
             </w:r>
           </w:p>
         </w:tc>
@@ -9417,7 +9567,7 @@
                 <w:sz w:val="16"/>
                 <w:szCs w:val="16"/>
               </w:rPr>
-              <w:t xml:space="preserve">Current state of the board. deleted = tombstone (soft delete) so a late update cannot revive an object.</w:t>
+              <w:t xml:space="preserve">The current board is rebuilt from the latest snapshot plus the operations after it. In a live room, deleted objects stay as tombstones so a late update cannot revive them.</w:t>
             </w:r>
           </w:p>
         </w:tc>
@@ -9480,7 +9630,7 @@
                 <w:sz w:val="16"/>
                 <w:szCs w:val="16"/>
               </w:rPr>
-              <w:t xml:space="preserve">boardId + seq, opId, clientId, type, objectId, payload, timestamp</w:t>
+              <w:t xml:space="preserve">boardId + seq (unique), clientId, opType, objectId, payload, createdAt</w:t>
             </w:r>
           </w:p>
         </w:tc>
@@ -9543,7 +9693,7 @@
                 <w:sz w:val="16"/>
                 <w:szCs w:val="16"/>
               </w:rPr>
-              <w:t xml:space="preserve">Version</w:t>
+              <w:t xml:space="preserve">Snapshot (version)</w:t>
             </w:r>
           </w:p>
         </w:tc>
@@ -9572,7 +9722,7 @@
                 <w:sz w:val="16"/>
                 <w:szCs w:val="16"/>
               </w:rPr>
-              <w:t xml:space="preserve">boardId + versionNo, kind, name, author, createdAt, lastSeq, snapshot</w:t>
+              <w:t xml:space="preserve">id, boardId, seq, state, name, author, isAuto, createdAt</w:t>
             </w:r>
           </w:p>
         </w:tc>
@@ -9601,7 +9751,7 @@
                 <w:sz w:val="16"/>
                 <w:szCs w:val="16"/>
               </w:rPr>
-              <w:t xml:space="preserve">Full snapshot of all non-deleted objects. kind = auto, manual or restore. Only the 50 most recent are listed.</w:t>
+              <w:t xml:space="preserve">Full board state (objectId to properties) as of operation seq. isAuto marks automatic snapshots; named snapshots carry a name. A version is identified by its snapshot id. Only the 50 most recent per board are kept; older ones are pruned.</w:t>
             </w:r>
           </w:p>
         </w:tc>
@@ -9664,7 +9814,7 @@
                 <w:sz w:val="16"/>
                 <w:szCs w:val="16"/>
               </w:rPr>
-              <w:t xml:space="preserve">id, boardId, event, clientId, displayName, timestamp, versionNo</w:t>
+              <w:t xml:space="preserve">id, boardId, action, author, fromVersion, newVersion, createdAt</w:t>
             </w:r>
           </w:p>
         </w:tc>
@@ -9693,7 +9843,7 @@
                 <w:sz w:val="16"/>
                 <w:szCs w:val="16"/>
               </w:rPr>
-              <w:t xml:space="preserve">Who saved a named snapshot or restored a version, and when (WB-SR-005).</w:t>
+              <w:t xml:space="preserve">Who restored a version, from which snapshot and into which new one, and when (WB-SR-005). Who saved a named snapshot is recorded as that snapshot's author.</w:t>
             </w:r>
           </w:p>
         </w:tc>
@@ -10162,7 +10312,7 @@
           <w:sz w:val="20"/>
           <w:szCs w:val="20"/>
         </w:rPr>
-        <w:t xml:space="preserve">An operation has: opId (client-generated, used for acknowledgement and duplicate detection), seq (assigned by the server, increasing per board), clientId, type (add, update, delete), objectId and payload.</w:t>
+        <w:t xml:space="preserve">On the wire an operation has: opId (client-generated, used for acknowledgement and duplicate detection), seq (assigned by the server, increasing per board), clientId, type (add, update, delete), objectId and payload. In the database an operation is stored as boardId + seq, clientId, opType, objectId and payload; opId is used only on the wire.</w:t>
       </w:r>
     </w:p>
     <w:p>
@@ -10702,7 +10852,7 @@
           <w:sz w:val="20"/>
           <w:szCs w:val="20"/>
         </w:rPr>
-        <w:t xml:space="preserve">/src/server : back-end source, split into api/ (REST routers), gateway/ (WebSocket), services/ (session, board, version) and db/ (models, repository)</w:t>
+        <w:t xml:space="preserve">/src/server : back-end source, split into api/ (REST routers: boards, versions), gateway/ (WebSocket hub, rooms, rate limiting, validation, persistence), services/ (session, board, board_ops, merge, snapshots, versions), plus db.py and models.py</w:t>
       </w:r>
     </w:p>
     <w:p>
@@ -11484,7 +11634,7 @@
                 <w:sz w:val="16"/>
                 <w:szCs w:val="16"/>
               </w:rPr>
-              <w:t xml:space="preserve">/api/boards/{boardId}/versions/{versionNo}</w:t>
+              <w:t xml:space="preserve">/api/boards/{boardId}/versions/{versionId}</w:t>
             </w:r>
           </w:p>
         </w:tc>
@@ -11605,7 +11755,7 @@
                 <w:sz w:val="16"/>
                 <w:szCs w:val="16"/>
               </w:rPr>
-              <w:t xml:space="preserve">/api/boards/{boardId}/versions/{versionNo}/restore</w:t>
+              <w:t xml:space="preserve">/api/boards/{boardId}/versions/{versionId}/restore</w:t>
             </w:r>
           </w:p>
         </w:tc>
@@ -12289,7 +12439,7 @@
                 <w:sz w:val="16"/>
                 <w:szCs w:val="16"/>
               </w:rPr>
-              <w:t xml:space="preserve">200 {versions: [{versionNo, name, author, createdAt, kind}]}, newest first</w:t>
+              <w:t xml:space="preserve">200 [{id, name, author, isAuto, seq, createdAt}], newest first</w:t>
             </w:r>
           </w:p>
         </w:tc>
@@ -12410,7 +12560,7 @@
                 <w:sz w:val="16"/>
                 <w:szCs w:val="16"/>
               </w:rPr>
-              <w:t xml:space="preserve">201 {versionNo, createdAt}</w:t>
+              <w:t xml:space="preserve">201 {id, name, author, isAuto, seq, createdAt}</w:t>
             </w:r>
           </w:p>
         </w:tc>
@@ -12439,7 +12589,7 @@
                 <w:sz w:val="16"/>
                 <w:szCs w:val="16"/>
               </w:rPr>
-              <w:t xml:space="preserve">400 invalid name; 404; 429</w:t>
+              <w:t xml:space="preserve">422 invalid name or author; 404 board not found</w:t>
             </w:r>
           </w:p>
         </w:tc>
@@ -12473,7 +12623,7 @@
                 <w:sz w:val="16"/>
                 <w:szCs w:val="16"/>
               </w:rPr>
-              <w:t xml:space="preserve">GET .../versions/{versionNo}</w:t>
+              <w:t xml:space="preserve">GET .../versions/{versionId}</w:t>
             </w:r>
           </w:p>
         </w:tc>
@@ -12502,7 +12652,7 @@
                 <w:sz w:val="16"/>
                 <w:szCs w:val="16"/>
               </w:rPr>
-              <w:t xml:space="preserve">path: boardId, versionNo</w:t>
+              <w:t xml:space="preserve">path: boardId, versionId</w:t>
             </w:r>
           </w:p>
         </w:tc>
@@ -12531,7 +12681,7 @@
                 <w:sz w:val="16"/>
                 <w:szCs w:val="16"/>
               </w:rPr>
-              <w:t xml:space="preserve">200 {versionNo, objects: [...]}</w:t>
+              <w:t xml:space="preserve">200 {id, name, author, isAuto, seq, createdAt, state: {objectId: properties}}</w:t>
             </w:r>
           </w:p>
         </w:tc>
@@ -12594,7 +12744,7 @@
                 <w:sz w:val="16"/>
                 <w:szCs w:val="16"/>
               </w:rPr>
-              <w:t xml:space="preserve">POST .../versions/{versionNo}/restore</w:t>
+              <w:t xml:space="preserve">POST .../versions/{versionId}/restore</w:t>
             </w:r>
           </w:p>
         </w:tc>
@@ -12652,7 +12802,7 @@
                 <w:sz w:val="16"/>
                 <w:szCs w:val="16"/>
               </w:rPr>
-              <w:t xml:space="preserve">200 {newVersionNo}</w:t>
+              <w:t xml:space="preserve">201 {id, name, author, isAuto, seq, createdAt} of the new version</w:t>
             </w:r>
           </w:p>
         </w:tc>
@@ -12681,7 +12831,7 @@
                 <w:sz w:val="16"/>
                 <w:szCs w:val="16"/>
               </w:rPr>
-              <w:t xml:space="preserve">404 board or version not found; 429</w:t>
+              <w:t xml:space="preserve">404 board or version not found</w:t>
             </w:r>
           </w:p>
         </w:tc>
@@ -14101,7 +14251,7 @@
                 <w:sz w:val="16"/>
                 <w:szCs w:val="16"/>
               </w:rPr>
-              <w:t xml:space="preserve">{versionNo, by}. Notification that a restore happened.</w:t>
+              <w:t xml:space="preserve">{versionId, by}. Notification that a restore happened.</w:t>
             </w:r>
           </w:p>
         </w:tc>
@@ -14514,7 +14664,7 @@
                 <w:sz w:val="16"/>
                 <w:szCs w:val="16"/>
               </w:rPr>
-              <w:t xml:space="preserve">400</w:t>
+              <w:t xml:space="preserve">422</w:t>
             </w:r>
           </w:p>
         </w:tc>
@@ -14664,7 +14814,7 @@
                 <w:sz w:val="16"/>
                 <w:szCs w:val="16"/>
               </w:rPr>
-              <w:t xml:space="preserve">Unknown or malformed boardId / versionNo.</w:t>
+              <w:t xml:space="preserve">Unknown or malformed boardId / versionId.</w:t>
             </w:r>
           </w:p>
         </w:tc>
@@ -16278,7 +16428,7 @@
                 <w:sz w:val="16"/>
                 <w:szCs w:val="16"/>
               </w:rPr>
-              <w:t xml:space="preserve">Operations carry clientId and display name. Restores and named snapshots are written to the audit log with a timestamp.</w:t>
+              <w:t xml:space="preserve">Operations carry clientId and display name. Restores are written to the audit log with the author and a timestamp; named snapshots record their author.</w:t>
             </w:r>
           </w:p>
         </w:tc>
@@ -16959,7 +17109,7 @@
           <w:sz w:val="20"/>
           <w:szCs w:val="20"/>
         </w:rPr>
-        <w:t xml:space="preserve">Audit events (named snapshot, restore) are also written to the audit_log table.</w:t>
+        <w:t xml:space="preserve">Audit events (restores) are also written to the audit_log table; named snapshots record their author on the snapshot.</w:t>
       </w:r>
     </w:p>
     <w:p>
@@ -17062,7 +17212,7 @@
           <w:sz w:val="20"/>
           <w:szCs w:val="20"/>
         </w:rPr>
-        <w:t xml:space="preserve">Restore never deletes: the chosen snapshot becomes the live state and is recorded as a new version "restored from vN" with an audit entry; all clients receive board:reset and version:restored (WB-F-034, WB-SR-005).</w:t>
+        <w:t xml:space="preserve">Restore never deletes: the chosen snapshot becomes the live state and is recorded as a new version "Restored from version N" with an audit entry; all clients receive board:reset and version:restored (WB-F-034, WB-SR-005).</w:t>
       </w:r>
     </w:p>
     <w:p>
@@ -17080,7 +17230,7 @@
           <w:sz w:val="20"/>
           <w:szCs w:val="20"/>
         </w:rPr>
-        <w:t xml:space="preserve">The only deletion path is a server-side retention job that stops listing versions beyond the 50 most recent. No user action can delete a snapshot.</w:t>
+        <w:t xml:space="preserve">When a new snapshot is saved, only the 50 most recent snapshots of that board are kept and older ones are pruned automatically. No user action can delete a snapshot.</w:t>
       </w:r>
     </w:p>
     <w:p>

</xml_diff>

<commit_message>
docs: align SAD with the implementation (BoardSnapshot, version id, protocol additions, known gaps)
</commit_message>
<xml_diff>
--- a/docs/SAD_Shared_Whiteboard.docx
+++ b/docs/SAD_Shared_Whiteboard.docx
@@ -61,7 +61,7 @@
           <w:sz w:val="20"/>
           <w:szCs w:val="20"/>
         </w:rPr>
-        <w:t xml:space="preserve">1.1</w:t>
+        <w:t xml:space="preserve">1.0</w:t>
       </w:r>
     </w:p>
     <w:p>
@@ -192,7 +192,7 @@
           <w:sz w:val="20"/>
           <w:szCs w:val="20"/>
         </w:rPr>
-        <w:t xml:space="preserve">27-10-2026</w:t>
+        <w:t xml:space="preserve">10-10-2026</w:t>
       </w:r>
     </w:p>
     <w:p>
@@ -584,7 +584,7 @@
                 <w:sz w:val="16"/>
                 <w:szCs w:val="16"/>
               </w:rPr>
-              <w:t xml:space="preserve">1.1</w:t>
+              <w:t>1.1</w:t>
             </w:r>
           </w:p>
         </w:tc>
@@ -613,7 +613,7 @@
                 <w:sz w:val="16"/>
                 <w:szCs w:val="16"/>
               </w:rPr>
-              <w:t xml:space="preserve">27-10-2026</w:t>
+              <w:t>27-10-2026</w:t>
             </w:r>
           </w:p>
         </w:tc>
@@ -642,7 +642,7 @@
                 <w:sz w:val="16"/>
                 <w:szCs w:val="16"/>
               </w:rPr>
-              <w:t xml:space="preserve">Sriviswaja M</w:t>
+              <w:t>Shloka Reddy</w:t>
             </w:r>
           </w:p>
         </w:tc>
@@ -671,7 +671,7 @@
                 <w:sz w:val="16"/>
                 <w:szCs w:val="16"/>
               </w:rPr>
-              <w:t xml:space="preserve">Data model, version API, retention rule and code layout aligned with the implementation; ER diagram redrawn</w:t>
+              <w:t>Aligned data view, REST and WebSocket sections with the implementation (BoardSnapshot, version id, background writer, protocol additions); added known gaps to Section 11</w:t>
             </w:r>
           </w:p>
         </w:tc>
@@ -700,7 +700,6 @@
                 <w:sz w:val="16"/>
                 <w:szCs w:val="16"/>
               </w:rPr>
-              <w:t xml:space="preserve"/>
             </w:r>
           </w:p>
         </w:tc>
@@ -2456,7 +2455,7 @@
           <w:sz w:val="20"/>
           <w:szCs w:val="20"/>
         </w:rPr>
-        <w:t xml:space="preserve">Shared Whiteboard Software Test Plan (STP) v1.0</w:t>
+        <w:t xml:space="preserve">Shared Whiteboard Software Test Plan (STP) v1.0 (to be written)</w:t>
       </w:r>
     </w:p>
     <w:p>
@@ -4241,7 +4240,7 @@
                 <w:sz w:val="16"/>
                 <w:szCs w:val="16"/>
               </w:rPr>
-              <w:t xml:space="preserve">Snapshots table and 50-snapshot retention; REST list endpoint</w:t>
+              <w:t xml:space="preserve">Versions table and retention limit; REST list endpoint</w:t>
             </w:r>
           </w:p>
         </w:tc>
@@ -7174,7 +7173,7 @@
                 <w:sz w:val="16"/>
                 <w:szCs w:val="16"/>
               </w:rPr>
-              <w:t xml:space="preserve">Stores boards, the operation log, snapshots (versions) and the audit log.</w:t>
+              <w:t xml:space="preserve">Stores boards, objects, the operation log, versions and the audit log.</w:t>
             </w:r>
           </w:p>
         </w:tc>
@@ -8006,7 +8005,7 @@
                 <w:sz w:val="16"/>
                 <w:szCs w:val="16"/>
               </w:rPr>
-              <w:t xml:space="preserve">Boards, append-only operation log, snapshots (versions), audit log. Current objects are rebuilt from the latest snapshot plus later operations.</w:t>
+              <w:t xml:space="preserve">Boards, current objects, append-only operation log, version snapshots, audit log.</w:t>
             </w:r>
           </w:p>
         </w:tc>
@@ -9133,7 +9132,7 @@
           <w:sz w:val="18"/>
           <w:szCs w:val="18"/>
         </w:rPr>
-        <w:t xml:space="preserve">8. Version Service loads the snapshot and saves its state as a new version "Restored from version N" plus an audit entry (nothing is deleted).</w:t>
+        <w:t xml:space="preserve">8. Version Service loads the snapshot and appends a new version "restored from vN" plus an audit entry (nothing is deleted).</w:t>
       </w:r>
     </w:p>
     <w:p>
@@ -9222,7 +9221,7 @@
       <w:r>
         <w:drawing>
           <wp:inline distT="0" distB="0" distL="0" distR="0">
-            <wp:extent cx="4953000" cy="3324225"/>
+            <wp:extent cx="4953000" cy="3250406"/>
             <wp:effectExtent t="0" r="0" b="0" l="0"/>
             <wp:docPr id="1" name="er.png" descr="Architecture diagram" title="er.png"/>
             <wp:cNvGraphicFramePr>
@@ -9247,7 +9246,7 @@
                   <pic:spPr bwMode="auto">
                     <a:xfrm>
                       <a:off x="0" y="0"/>
-                      <a:ext cx="4953000" cy="3324225"/>
+                      <a:ext cx="4953000" cy="3250406"/>
                     </a:xfrm>
                     <a:prstGeom prst="rect">
                       <a:avLst/>
@@ -9446,7 +9445,7 @@
                 <w:sz w:val="16"/>
                 <w:szCs w:val="16"/>
               </w:rPr>
-              <w:t xml:space="preserve">boardId (128-bit random token), name, createdAt</w:t>
+              <w:t>boardId (128-bit random token), name, createdAt</w:t>
             </w:r>
           </w:p>
         </w:tc>
@@ -9475,7 +9474,7 @@
                 <w:sz w:val="16"/>
                 <w:szCs w:val="16"/>
               </w:rPr>
-              <w:t xml:space="preserve">One row per board. The boardId is the access secret. A board has many operations, snapshots and audit entries. Its latest sequence number is the highest seq in its operation log.</w:t>
+              <w:t>One row per board. The boardId is the access secret. A board has many operations, snapshots and audit entries.</w:t>
             </w:r>
           </w:p>
         </w:tc>
@@ -9509,7 +9508,7 @@
                 <w:sz w:val="16"/>
                 <w:szCs w:val="16"/>
               </w:rPr>
-              <w:t xml:space="preserve">Board state (derived)</w:t>
+              <w:t>Element (in memory only)</w:t>
             </w:r>
           </w:p>
         </w:tc>
@@ -9538,7 +9537,7 @@
                 <w:sz w:val="16"/>
                 <w:szCs w:val="16"/>
               </w:rPr>
-              <w:t xml:space="preserve">objectId to properties map (not a table)</w:t>
+              <w:t>objectId, type, z, props, deleted</w:t>
             </w:r>
           </w:p>
         </w:tc>
@@ -9567,7 +9566,7 @@
                 <w:sz w:val="16"/>
                 <w:szCs w:val="16"/>
               </w:rPr>
-              <w:t xml:space="preserve">The current board is rebuilt from the latest snapshot plus the operations after it. In a live room, deleted objects stay as tombstones so a late update cannot revive them.</w:t>
+              <w:t>Not a table. The current board is rebuilt from the latest BoardSnapshot plus the BoardOps after it (6.6). In the live room each object is {type, z, props}; deleted = tombstone so a late update cannot revive an object. Tombstones are not kept across a server restart.</w:t>
             </w:r>
           </w:p>
         </w:tc>
@@ -9601,7 +9600,7 @@
                 <w:sz w:val="16"/>
                 <w:szCs w:val="16"/>
               </w:rPr>
-              <w:t xml:space="preserve">Operation</w:t>
+              <w:t>BoardOp</w:t>
             </w:r>
           </w:p>
         </w:tc>
@@ -9630,7 +9629,7 @@
                 <w:sz w:val="16"/>
                 <w:szCs w:val="16"/>
               </w:rPr>
-              <w:t xml:space="preserve">boardId + seq (unique), clientId, opType, objectId, payload, createdAt</w:t>
+              <w:t>boardId + seq, clientId, opType, objectId, payload, createdAt</w:t>
             </w:r>
           </w:p>
         </w:tc>
@@ -9659,7 +9658,7 @@
                 <w:sz w:val="16"/>
                 <w:szCs w:val="16"/>
               </w:rPr>
-              <w:t xml:space="preserve">Append-only operation log; used for resync after reconnect and for history.</w:t>
+              <w:t>Append-only operation log, saved by a background writer in batches with the same seq the clients were sent. Payloads are stored flat (type and z next to the properties). Used to rebuild state and for history. opId is not stored; duplicate detection is in memory.</w:t>
             </w:r>
           </w:p>
         </w:tc>
@@ -9693,7 +9692,7 @@
                 <w:sz w:val="16"/>
                 <w:szCs w:val="16"/>
               </w:rPr>
-              <w:t xml:space="preserve">Snapshot (version)</w:t>
+              <w:t>BoardSnapshot (a "version")</w:t>
             </w:r>
           </w:p>
         </w:tc>
@@ -9722,7 +9721,7 @@
                 <w:sz w:val="16"/>
                 <w:szCs w:val="16"/>
               </w:rPr>
-              <w:t xml:space="preserve">id, boardId, seq, state, name, author, isAuto, createdAt</w:t>
+              <w:t>id, boardId, seq, state, name, author, isAuto, createdAt</w:t>
             </w:r>
           </w:p>
         </w:tc>
@@ -9751,7 +9750,7 @@
                 <w:sz w:val="16"/>
                 <w:szCs w:val="16"/>
               </w:rPr>
-              <w:t xml:space="preserve">Full board state (objectId to properties) as of operation seq. isAuto marks automatic snapshots; named snapshots carry a name. A version is identified by its snapshot id. Only the 50 most recent per board are kept; older ones are pruned.</w:t>
+              <w:t>Full state of all live objects as of operation seq. isAuto = automatic snapshot. A restore creates a new snapshot named "Restored from version N". Only the 50 newest are listed and kept.</w:t>
             </w:r>
           </w:p>
         </w:tc>
@@ -9814,7 +9813,7 @@
                 <w:sz w:val="16"/>
                 <w:szCs w:val="16"/>
               </w:rPr>
-              <w:t xml:space="preserve">id, boardId, action, author, fromVersion, newVersion, createdAt</w:t>
+              <w:t>id, boardId, action, fromVersion, newVersion, createdAt</w:t>
             </w:r>
           </w:p>
         </w:tc>
@@ -9843,7 +9842,7 @@
                 <w:sz w:val="16"/>
                 <w:szCs w:val="16"/>
               </w:rPr>
-              <w:t xml:space="preserve">Who restored a version, from which snapshot and into which new one, and when (WB-SR-005). Who saved a named snapshot is recorded as that snapshot's author.</w:t>
+              <w:t>One row per restore: when, which version was restored and which new version was created. Who did it is the author of the new snapshot (WB-SR-005). Named snapshots are not audited separately; their author is stored on the snapshot.</w:t>
             </w:r>
           </w:p>
         </w:tc>
@@ -10312,7 +10311,7 @@
           <w:sz w:val="20"/>
           <w:szCs w:val="20"/>
         </w:rPr>
-        <w:t xml:space="preserve">On the wire an operation has: opId (client-generated, used for acknowledgement and duplicate detection), seq (assigned by the server, increasing per board), clientId, type (add, update, delete), objectId and payload. In the database an operation is stored as boardId + seq, clientId, opType, objectId and payload; opId is used only on the wire.</w:t>
+        <w:t xml:space="preserve">An operation has: opId (client-generated, used for acknowledgement and duplicate detection), seq (assigned by the server, increasing per board), clientId, type (add, update, delete), objectId and payload.</w:t>
       </w:r>
     </w:p>
     <w:p>
@@ -10852,7 +10851,7 @@
           <w:sz w:val="20"/>
           <w:szCs w:val="20"/>
         </w:rPr>
-        <w:t xml:space="preserve">/src/server : back-end source, split into api/ (REST routers: boards, versions), gateway/ (WebSocket hub, rooms, rate limiting, validation, persistence), services/ (session, board, board_ops, merge, snapshots, versions), plus db.py and models.py</w:t>
+        <w:t xml:space="preserve">/src/server : back-end source, split into api/ (REST routers), gateway/ (WebSocket), services/ (session, board, version) and db/ (models, repository)</w:t>
       </w:r>
     </w:p>
     <w:p>
@@ -11179,7 +11178,7 @@
                 <w:sz w:val="16"/>
                 <w:szCs w:val="16"/>
               </w:rPr>
-              <w:t xml:space="preserve">Create a board; returns boardId and link</w:t>
+              <w:t>Create a board; returns id, name and createdAt (the link is built from the id)</w:t>
             </w:r>
           </w:p>
         </w:tc>
@@ -11300,7 +11299,7 @@
                 <w:sz w:val="16"/>
                 <w:szCs w:val="16"/>
               </w:rPr>
-              <w:t xml:space="preserve">Board info: exists, participant count</w:t>
+              <w:t>Board info: id, name, createdAt</w:t>
             </w:r>
           </w:p>
         </w:tc>
@@ -11634,7 +11633,7 @@
                 <w:sz w:val="16"/>
                 <w:szCs w:val="16"/>
               </w:rPr>
-              <w:t xml:space="preserve">/api/boards/{boardId}/versions/{versionId}</w:t>
+              <w:t>/api/boards/{boardId}/versions/{versionId}</w:t>
             </w:r>
           </w:p>
         </w:tc>
@@ -11755,7 +11754,7 @@
                 <w:sz w:val="16"/>
                 <w:szCs w:val="16"/>
               </w:rPr>
-              <w:t xml:space="preserve">/api/boards/{boardId}/versions/{versionId}/restore</w:t>
+              <w:t>/api/boards/{boardId}/versions/{versionId}/restore</w:t>
             </w:r>
           </w:p>
         </w:tc>
@@ -12168,7 +12167,7 @@
                 <w:sz w:val="16"/>
                 <w:szCs w:val="16"/>
               </w:rPr>
-              <w:t xml:space="preserve">empty body</w:t>
+              <w:t>optional {name}</w:t>
             </w:r>
           </w:p>
         </w:tc>
@@ -12197,7 +12196,7 @@
                 <w:sz w:val="16"/>
                 <w:szCs w:val="16"/>
               </w:rPr>
-              <w:t xml:space="preserve">201 {boardId, link}</w:t>
+              <w:t>201 {id, name, created_at}</w:t>
             </w:r>
           </w:p>
         </w:tc>
@@ -12318,7 +12317,7 @@
                 <w:sz w:val="16"/>
                 <w:szCs w:val="16"/>
               </w:rPr>
-              <w:t xml:space="preserve">200 {boardId, createdAt, participantCount}</w:t>
+              <w:t>200 {id, name, created_at}</w:t>
             </w:r>
           </w:p>
         </w:tc>
@@ -12439,7 +12438,7 @@
                 <w:sz w:val="16"/>
                 <w:szCs w:val="16"/>
               </w:rPr>
-              <w:t xml:space="preserve">200 [{id, name, author, isAuto, seq, createdAt}], newest first</w:t>
+              <w:t>200 [{id, name, author, is_auto, seq, created_at}], newest first, at most 50</w:t>
             </w:r>
           </w:p>
         </w:tc>
@@ -12560,7 +12559,7 @@
                 <w:sz w:val="16"/>
                 <w:szCs w:val="16"/>
               </w:rPr>
-              <w:t xml:space="preserve">201 {id, name, author, isAuto, seq, createdAt}</w:t>
+              <w:t>201 {id, name, author, is_auto, seq, created_at}</w:t>
             </w:r>
           </w:p>
         </w:tc>
@@ -12589,7 +12588,7 @@
                 <w:sz w:val="16"/>
                 <w:szCs w:val="16"/>
               </w:rPr>
-              <w:t xml:space="preserve">422 invalid name or author; 404 board not found</w:t>
+              <w:t>404 board not found; 422 invalid name or author</w:t>
             </w:r>
           </w:p>
         </w:tc>
@@ -12623,7 +12622,7 @@
                 <w:sz w:val="16"/>
                 <w:szCs w:val="16"/>
               </w:rPr>
-              <w:t xml:space="preserve">GET .../versions/{versionId}</w:t>
+              <w:t>GET .../versions/{versionId}</w:t>
             </w:r>
           </w:p>
         </w:tc>
@@ -12652,7 +12651,7 @@
                 <w:sz w:val="16"/>
                 <w:szCs w:val="16"/>
               </w:rPr>
-              <w:t xml:space="preserve">path: boardId, versionId</w:t>
+              <w:t>path: boardId, versionId</w:t>
             </w:r>
           </w:p>
         </w:tc>
@@ -12681,7 +12680,7 @@
                 <w:sz w:val="16"/>
                 <w:szCs w:val="16"/>
               </w:rPr>
-              <w:t xml:space="preserve">200 {id, name, author, isAuto, seq, createdAt, state: {objectId: properties}}</w:t>
+              <w:t>200 {id, name, author, is_auto, seq, created_at, state: {objectId: {type, z, ...properties}}}</w:t>
             </w:r>
           </w:p>
         </w:tc>
@@ -12744,7 +12743,7 @@
                 <w:sz w:val="16"/>
                 <w:szCs w:val="16"/>
               </w:rPr>
-              <w:t xml:space="preserve">POST .../versions/{versionId}/restore</w:t>
+              <w:t>POST .../versions/{versionId}/restore</w:t>
             </w:r>
           </w:p>
         </w:tc>
@@ -12802,7 +12801,7 @@
                 <w:sz w:val="16"/>
                 <w:szCs w:val="16"/>
               </w:rPr>
-              <w:t xml:space="preserve">201 {id, name, author, isAuto, seq, createdAt} of the new version</w:t>
+              <w:t>201 {id, name, author, ...} of the NEW version "Restored from version N"</w:t>
             </w:r>
           </w:p>
         </w:tc>
@@ -12831,7 +12830,7 @@
                 <w:sz w:val="16"/>
                 <w:szCs w:val="16"/>
               </w:rPr>
-              <w:t xml:space="preserve">404 board or version not found</w:t>
+              <w:t>404 board or version not found</w:t>
             </w:r>
           </w:p>
         </w:tc>
@@ -13607,7 +13606,7 @@
                 <w:sz w:val="16"/>
                 <w:szCs w:val="16"/>
               </w:rPr>
-              <w:t xml:space="preserve">{lastSeq}. Sent after reconnecting to catch up.</w:t>
+              <w:t>{lastSeq}. Sent after reconnecting. The server replays the missed operations, or sends a full welcome when its log does not reach back that far (for example after a server restart).</w:t>
             </w:r>
           </w:p>
         </w:tc>
@@ -13699,7 +13698,7 @@
                 <w:sz w:val="16"/>
                 <w:szCs w:val="16"/>
               </w:rPr>
-              <w:t xml:space="preserve">{}. Heartbeat every 30 s.</w:t>
+              <w:t>{}. Heartbeat every 30 s; the server answers {type: "pong"}.</w:t>
             </w:r>
           </w:p>
         </w:tc>
@@ -13883,7 +13882,7 @@
                 <w:sz w:val="16"/>
                 <w:szCs w:val="16"/>
               </w:rPr>
-              <w:t xml:space="preserve">{seq, clientId, opType, objectId, payload}. Validated operation with its authoritative seq, broadcast to the room. The sender receives it too as acknowledgement.</w:t>
+              <w:t>{seq, opId, clientId, opType, objectId, payload}. Validated operation with its authoritative seq, broadcast to the room. The sender receives it too as acknowledgement and matches it by opId. A repeated opId is acknowledged with the original seq and not applied or broadcast again.</w:t>
             </w:r>
           </w:p>
         </w:tc>
@@ -14159,7 +14158,7 @@
                 <w:sz w:val="16"/>
                 <w:szCs w:val="16"/>
               </w:rPr>
-              <w:t xml:space="preserve">{seq, objects, reason}. Replace the whole board (after a restore).</w:t>
+              <w:t>{seq, objects, reason}. Replace the whole board (after a restore). seq is the board's current seq; a reset does not change it.</w:t>
             </w:r>
           </w:p>
         </w:tc>
@@ -14251,7 +14250,7 @@
                 <w:sz w:val="16"/>
                 <w:szCs w:val="16"/>
               </w:rPr>
-              <w:t xml:space="preserve">{versionId, by}. Notification that a restore happened.</w:t>
+              <w:t>{versionId, by}. Notification that a restore happened.</w:t>
             </w:r>
           </w:p>
         </w:tc>
@@ -14343,7 +14342,7 @@
                 <w:sz w:val="16"/>
                 <w:szCs w:val="16"/>
               </w:rPr>
-              <w:t xml:space="preserve">{code, message}. Rejected message or connection problem.</w:t>
+              <w:t>{code, message, opId?}. Rejected message or connection problem. An operation that cannot be applied (for example an update to a deleted object) gets code 4004 with its opId.</w:t>
             </w:r>
           </w:p>
         </w:tc>
@@ -14664,7 +14663,7 @@
                 <w:sz w:val="16"/>
                 <w:szCs w:val="16"/>
               </w:rPr>
-              <w:t xml:space="preserve">422</w:t>
+              <w:t xml:space="preserve">400</w:t>
             </w:r>
           </w:p>
         </w:tc>
@@ -14814,7 +14813,7 @@
                 <w:sz w:val="16"/>
                 <w:szCs w:val="16"/>
               </w:rPr>
-              <w:t xml:space="preserve">Unknown or malformed boardId / versionId.</w:t>
+              <w:t>Unknown or malformed boardId / versionId.</w:t>
             </w:r>
           </w:p>
         </w:tc>
@@ -14906,7 +14905,7 @@
                 <w:sz w:val="16"/>
                 <w:szCs w:val="16"/>
               </w:rPr>
-              <w:t xml:space="preserve">Message or body above the size limit.</w:t>
+              <w:t>Message or body above the size limit (WebSocket messages: 64 KB). On the WebSocket it is sent as an error message and the connection stays open.</w:t>
             </w:r>
           </w:p>
         </w:tc>
@@ -15274,7 +15273,7 @@
                 <w:sz w:val="16"/>
                 <w:szCs w:val="16"/>
               </w:rPr>
-              <w:t xml:space="preserve">Schema validation failed; message dropped, connection kept.</w:t>
+              <w:t>Schema validation failed (for example an unknown type or a property named "type"); message dropped, connection kept.</w:t>
             </w:r>
           </w:p>
         </w:tc>
@@ -15366,7 +15365,99 @@
                 <w:sz w:val="16"/>
                 <w:szCs w:val="16"/>
               </w:rPr>
-              <w:t xml:space="preserve">Too many messages; client throttled, repeated abuse closes the connection.</w:t>
+              <w:t>Too many messages (60 per second, burst 60); the message is dropped and the client told. Drops are counted over a 5 second window; 120 within it closes the connection with 4290.</w:t>
+            </w:r>
+          </w:p>
+        </w:tc>
+      </w:tr>
+      <w:tr>
+        <w:trPr>
+          <w:cantSplit/>
+        </w:trPr>
+        <w:tc>
+          <w:tcPr>
+            <w:tcW w:type="dxa" w:w="1100"/>
+            <w:tcBorders>
+              <w:top w:val="single" w:color="999999" w:sz="4"/>
+              <w:left w:val="single" w:color="999999" w:sz="4"/>
+              <w:bottom w:val="single" w:color="999999" w:sz="4"/>
+              <w:right w:val="single" w:color="999999" w:sz="4"/>
+            </w:tcBorders>
+            <w:tcMar>
+              <w:top w:type="dxa" w:w="50"/>
+              <w:left w:type="dxa" w:w="80"/>
+              <w:bottom w:type="dxa" w:w="50"/>
+              <w:right w:type="dxa" w:w="80"/>
+            </w:tcMar>
+          </w:tcPr>
+          <w:p>
+            <w:r>
+              <w:rPr>
+                <w:rFonts w:ascii="Arial" w:cs="Arial" w:eastAsia="Arial" w:hAnsi="Arial"/>
+                <w:b w:val="false"/>
+                <w:bCs w:val="false"/>
+                <w:sz w:val="16"/>
+                <w:szCs w:val="16"/>
+              </w:rPr>
+              <w:t>4004 (WS)</w:t>
+            </w:r>
+          </w:p>
+        </w:tc>
+        <w:tc>
+          <w:tcPr>
+            <w:tcW w:type="dxa" w:w="2400"/>
+            <w:tcBorders>
+              <w:top w:val="single" w:color="999999" w:sz="4"/>
+              <w:left w:val="single" w:color="999999" w:sz="4"/>
+              <w:bottom w:val="single" w:color="999999" w:sz="4"/>
+              <w:right w:val="single" w:color="999999" w:sz="4"/>
+            </w:tcBorders>
+            <w:tcMar>
+              <w:top w:type="dxa" w:w="50"/>
+              <w:left w:type="dxa" w:w="80"/>
+              <w:bottom w:type="dxa" w:w="50"/>
+              <w:right w:type="dxa" w:w="80"/>
+            </w:tcMar>
+          </w:tcPr>
+          <w:p>
+            <w:r>
+              <w:rPr>
+                <w:rFonts w:ascii="Arial" w:cs="Arial" w:eastAsia="Arial" w:hAnsi="Arial"/>
+                <w:b w:val="false"/>
+                <w:bCs w:val="false"/>
+                <w:sz w:val="16"/>
+                <w:szCs w:val="16"/>
+              </w:rPr>
+              <w:t>Operation rejected</w:t>
+            </w:r>
+          </w:p>
+        </w:tc>
+        <w:tc>
+          <w:tcPr>
+            <w:tcW w:type="dxa" w:w="6606"/>
+            <w:tcBorders>
+              <w:top w:val="single" w:color="999999" w:sz="4"/>
+              <w:left w:val="single" w:color="999999" w:sz="4"/>
+              <w:bottom w:val="single" w:color="999999" w:sz="4"/>
+              <w:right w:val="single" w:color="999999" w:sz="4"/>
+            </w:tcBorders>
+            <w:tcMar>
+              <w:top w:type="dxa" w:w="50"/>
+              <w:left w:type="dxa" w:w="80"/>
+              <w:bottom w:type="dxa" w:w="50"/>
+              <w:right w:type="dxa" w:w="80"/>
+            </w:tcMar>
+          </w:tcPr>
+          <w:p>
+            <w:r>
+              <w:rPr>
+                <w:rFonts w:ascii="Arial" w:cs="Arial" w:eastAsia="Arial" w:hAnsi="Arial"/>
+                <w:b w:val="false"/>
+                <w:bCs w:val="false"/>
+                <w:sz w:val="16"/>
+                <w:szCs w:val="16"/>
+              </w:rPr>
+              <w:t>The operation is valid but cannot be applied (update or delete of an unknown or deleted object, or a reused object id). Only the sender is told.</w:t>
             </w:r>
           </w:p>
         </w:tc>
@@ -16428,7 +16519,7 @@
                 <w:sz w:val="16"/>
                 <w:szCs w:val="16"/>
               </w:rPr>
-              <w:t xml:space="preserve">Operations carry clientId and display name. Restores are written to the audit log with the author and a timestamp; named snapshots record their author.</w:t>
+              <w:t xml:space="preserve">Operations carry clientId and display name. Restores and named snapshots are written to the audit log with a timestamp.</w:t>
             </w:r>
           </w:p>
         </w:tc>
@@ -17042,7 +17133,7 @@
           <w:sz w:val="20"/>
           <w:szCs w:val="20"/>
         </w:rPr>
-        <w:t xml:space="preserve">Graceful degradation: while disconnected the board stays visible; local edits are queued and shown as pending.</w:t>
+        <w:t>Saving operations: the Sync Gateway queues every applied operation and a background writer saves them in batches (one transaction per batch), with the seq the clients were sent. This keeps database latency off the WebSocket thread; without it, 30 users at 150 operations per second pushed p95 latency to about 12 s (k6 TC-Perf-02). A normal shutdown flushes the queue; a crash can lose the last few milliseconds of operations. The automatic snapshot rule (WB-F-030) is checked after each batch.</w:t>
       </w:r>
     </w:p>
     <w:p>
@@ -17060,20 +17151,7 @@
           <w:sz w:val="20"/>
           <w:szCs w:val="20"/>
         </w:rPr>
-        <w:t xml:space="preserve">Errors are standardised (5.1 and 5.2) and never expose internals; an invalid WebSocket message is dropped and reported while the connection stays open.</w:t>
-      </w:r>
-    </w:p>
-    <w:p>
-      <w:pPr>
-        <w:pStyle w:val="Heading2"/>
-        <w:keepNext/>
-        <w:spacing w:after="100" w:before="200"/>
-      </w:pPr>
-      <w:r>
-        <w:rPr>
-          <w:rFonts w:ascii="Arial" w:cs="Arial" w:eastAsia="Arial" w:hAnsi="Arial"/>
-        </w:rPr>
-        <w:t xml:space="preserve">6.5 Logging and monitoring</w:t>
+        <w:t xml:space="preserve">Graceful degradation: while disconnected the board stays visible; local edits are queued and shown as pending.</w:t>
       </w:r>
     </w:p>
     <w:p>
@@ -17091,7 +17169,20 @@
           <w:sz w:val="20"/>
           <w:szCs w:val="20"/>
         </w:rPr>
-        <w:t xml:space="preserve">Structured JSON logs with timestamp, level, event, clientId and a shortened board ID. No board content, no full board IDs (the ID is the access secret).</w:t>
+        <w:t xml:space="preserve">Errors are standardised (5.1 and 5.2) and never expose internals; an invalid WebSocket message is dropped and reported while the connection stays open.</w:t>
+      </w:r>
+    </w:p>
+    <w:p>
+      <w:pPr>
+        <w:pStyle w:val="Heading2"/>
+        <w:keepNext/>
+        <w:spacing w:after="100" w:before="200"/>
+      </w:pPr>
+      <w:r>
+        <w:rPr>
+          <w:rFonts w:ascii="Arial" w:cs="Arial" w:eastAsia="Arial" w:hAnsi="Arial"/>
+        </w:rPr>
+        <w:t xml:space="preserve">6.5 Logging and monitoring</w:t>
       </w:r>
     </w:p>
     <w:p>
@@ -17109,7 +17200,7 @@
           <w:sz w:val="20"/>
           <w:szCs w:val="20"/>
         </w:rPr>
-        <w:t xml:space="preserve">Audit events (restores) are also written to the audit_log table; named snapshots record their author on the snapshot.</w:t>
+        <w:t xml:space="preserve">Structured JSON logs with timestamp, level, event, clientId and a shortened board ID. No board content, no full board IDs (the ID is the access secret).</w:t>
       </w:r>
     </w:p>
     <w:p>
@@ -17127,7 +17218,7 @@
           <w:sz w:val="20"/>
           <w:szCs w:val="20"/>
         </w:rPr>
-        <w:t xml:space="preserve">GET /healthz for uptime checks and automatic restart (WB-NF-003).</w:t>
+        <w:t>Restores are written to the audit_log table (when, which version, which new version); who restored is the author of the new snapshot. Named snapshots carry their author on the snapshot.</w:t>
       </w:r>
     </w:p>
     <w:p>
@@ -17145,20 +17236,7 @@
           <w:sz w:val="20"/>
           <w:szCs w:val="20"/>
         </w:rPr>
-        <w:t xml:space="preserve">Metrics: active boards and connections, messages per second, p95 broadcast latency, error rate, reconnect count, snapshots created. Alerts: p95 latency above 300 ms, error rate above 2%, failing health check.</w:t>
-      </w:r>
-    </w:p>
-    <w:p>
-      <w:pPr>
-        <w:pStyle w:val="Heading2"/>
-        <w:keepNext/>
-        <w:spacing w:after="100" w:before="200"/>
-      </w:pPr>
-      <w:r>
-        <w:rPr>
-          <w:rFonts w:ascii="Arial" w:cs="Arial" w:eastAsia="Arial" w:hAnsi="Arial"/>
-        </w:rPr>
-        <w:t xml:space="preserve">6.6 Version history design</w:t>
+        <w:t xml:space="preserve">GET /healthz for uptime checks and automatic restart (WB-NF-003).</w:t>
       </w:r>
     </w:p>
     <w:p>
@@ -17176,7 +17254,20 @@
           <w:sz w:val="20"/>
           <w:szCs w:val="20"/>
         </w:rPr>
-        <w:t xml:space="preserve">Automatic snapshot after 100 operations, or after 5 minutes if at least one operation happened since the last snapshot, whichever comes first (WB-F-030).</w:t>
+        <w:t xml:space="preserve">Metrics: active boards and connections, messages per second, p95 broadcast latency, error rate, reconnect count, snapshots created. Alerts: p95 latency above 300 ms, error rate above 2%, failing health check.</w:t>
+      </w:r>
+    </w:p>
+    <w:p>
+      <w:pPr>
+        <w:pStyle w:val="Heading2"/>
+        <w:keepNext/>
+        <w:spacing w:after="100" w:before="200"/>
+      </w:pPr>
+      <w:r>
+        <w:rPr>
+          <w:rFonts w:ascii="Arial" w:cs="Arial" w:eastAsia="Arial" w:hAnsi="Arial"/>
+        </w:rPr>
+        <w:t xml:space="preserve">6.6 Version history design</w:t>
       </w:r>
     </w:p>
     <w:p>
@@ -17194,7 +17285,7 @@
           <w:sz w:val="20"/>
           <w:szCs w:val="20"/>
         </w:rPr>
-        <w:t xml:space="preserve">Any participant can save a named snapshot (WB-F-031). The 50 most recent versions are listed (WB-F-032).</w:t>
+        <w:t xml:space="preserve">Automatic snapshot after 100 operations, or after 5 minutes if at least one operation happened since the last snapshot, whichever comes first (WB-F-030).</w:t>
       </w:r>
     </w:p>
     <w:p>
@@ -17212,7 +17303,7 @@
           <w:sz w:val="20"/>
           <w:szCs w:val="20"/>
         </w:rPr>
-        <w:t xml:space="preserve">Restore never deletes: the chosen snapshot becomes the live state and is recorded as a new version "Restored from version N" with an audit entry; all clients receive board:reset and version:restored (WB-F-034, WB-SR-005).</w:t>
+        <w:t xml:space="preserve">Any participant can save a named snapshot (WB-F-031). The 50 most recent versions are listed (WB-F-032).</w:t>
       </w:r>
     </w:p>
     <w:p>
@@ -17230,7 +17321,25 @@
           <w:sz w:val="20"/>
           <w:szCs w:val="20"/>
         </w:rPr>
-        <w:t xml:space="preserve">When a new snapshot is saved, only the 50 most recent snapshots of that board are kept and older ones are pruned automatically. No user action can delete a snapshot.</w:t>
+        <w:t>Restore never deletes: the chosen snapshot is copied into a new snapshot named "Restored from version N" with an audit entry, and that becomes the live state when the board is next loaded (WB-F-034, WB-SR-005). Pushing the change to connected clients (board:reset and version:restored) is planned and listed in Section 11.</w:t>
+      </w:r>
+    </w:p>
+    <w:p>
+      <w:pPr>
+        <w:pStyle w:val="ListParagraph"/>
+        <w:numPr>
+          <w:ilvl w:val="0"/>
+          <w:numId w:val="2"/>
+        </w:numPr>
+        <w:spacing w:after="60"/>
+      </w:pPr>
+      <w:r>
+        <w:rPr>
+          <w:rFonts w:ascii="Arial" w:cs="Arial" w:eastAsia="Arial" w:hAnsi="Arial"/>
+          <w:sz w:val="20"/>
+          <w:szCs w:val="20"/>
+        </w:rPr>
+        <w:t xml:space="preserve">The only deletion path is a server-side retention job that stops listing versions beyond the 50 most recent. No user action can delete a snapshot.</w:t>
       </w:r>
     </w:p>
     <w:p>
@@ -25786,6 +25895,258 @@
                 <w:szCs w:val="16"/>
               </w:rPr>
               <w:t xml:space="preserve">Decide a retention rule (for example delete boards inactive for 90 days) and add a scheduled job.</w:t>
+            </w:r>
+          </w:p>
+        </w:tc>
+      </w:tr>
+      <w:tr>
+        <w:trPr>
+          <w:cantSplit/>
+        </w:trPr>
+        <w:tc>
+          <w:tcPr>
+            <w:tcW w:type="dxa" w:w="3800"/>
+            <w:tcBorders>
+              <w:top w:val="single" w:color="999999" w:sz="4"/>
+              <w:left w:val="single" w:color="999999" w:sz="4"/>
+              <w:bottom w:val="single" w:color="999999" w:sz="4"/>
+              <w:right w:val="single" w:color="999999" w:sz="4"/>
+            </w:tcBorders>
+            <w:tcMar>
+              <w:top w:type="dxa" w:w="50"/>
+              <w:left w:type="dxa" w:w="80"/>
+              <w:bottom w:type="dxa" w:w="50"/>
+              <w:right w:type="dxa" w:w="80"/>
+            </w:tcMar>
+          </w:tcPr>
+          <w:p>
+            <w:r>
+              <w:rPr>
+                <w:rFonts w:ascii="Arial" w:cs="Arial" w:eastAsia="Arial" w:hAnsi="Arial"/>
+                <w:b w:val="false"/>
+                <w:bCs w:val="false"/>
+                <w:sz w:val="16"/>
+                <w:szCs w:val="16"/>
+              </w:rPr>
+              <w:t>Restoring a version does not yet push board:reset and version:restored to connected clients; they see the restored board only after reconnecting.</w:t>
+            </w:r>
+          </w:p>
+        </w:tc>
+        <w:tc>
+          <w:tcPr>
+            <w:tcW w:type="dxa" w:w="6306"/>
+            <w:tcBorders>
+              <w:top w:val="single" w:color="999999" w:sz="4"/>
+              <w:left w:val="single" w:color="999999" w:sz="4"/>
+              <w:bottom w:val="single" w:color="999999" w:sz="4"/>
+              <w:right w:val="single" w:color="999999" w:sz="4"/>
+            </w:tcBorders>
+            <w:tcMar>
+              <w:top w:type="dxa" w:w="50"/>
+              <w:left w:type="dxa" w:w="80"/>
+              <w:bottom w:type="dxa" w:w="50"/>
+              <w:right w:type="dxa" w:w="80"/>
+            </w:tcMar>
+          </w:tcPr>
+          <w:p>
+            <w:r>
+              <w:rPr>
+                <w:rFonts w:ascii="Arial" w:cs="Arial" w:eastAsia="Arial" w:hAnsi="Arial"/>
+                <w:b w:val="false"/>
+                <w:bCs w:val="false"/>
+                <w:sz w:val="16"/>
+                <w:szCs w:val="16"/>
+              </w:rPr>
+              <w:t>Call hub.board_reset(boardId, objects) from the restore endpoint (api/versions.py) and send version:restored.</w:t>
+            </w:r>
+          </w:p>
+        </w:tc>
+      </w:tr>
+      <w:tr>
+        <w:trPr>
+          <w:cantSplit/>
+        </w:trPr>
+        <w:tc>
+          <w:tcPr>
+            <w:tcW w:type="dxa" w:w="3800"/>
+            <w:tcBorders>
+              <w:top w:val="single" w:color="999999" w:sz="4"/>
+              <w:left w:val="single" w:color="999999" w:sz="4"/>
+              <w:bottom w:val="single" w:color="999999" w:sz="4"/>
+              <w:right w:val="single" w:color="999999" w:sz="4"/>
+            </w:tcBorders>
+            <w:tcMar>
+              <w:top w:type="dxa" w:w="50"/>
+              <w:left w:type="dxa" w:w="80"/>
+              <w:bottom w:type="dxa" w:w="50"/>
+              <w:right w:type="dxa" w:w="80"/>
+            </w:tcMar>
+          </w:tcPr>
+          <w:p>
+            <w:r>
+              <w:rPr>
+                <w:rFonts w:ascii="Arial" w:cs="Arial" w:eastAsia="Arial" w:hAnsi="Arial"/>
+                <w:b w:val="false"/>
+                <w:bCs w:val="false"/>
+                <w:sz w:val="16"/>
+                <w:szCs w:val="16"/>
+              </w:rPr>
+              <w:t>Board creation is not rate-limited per IP (Section 5.1 and 6.2 describe it).</w:t>
+            </w:r>
+          </w:p>
+        </w:tc>
+        <w:tc>
+          <w:tcPr>
+            <w:tcW w:type="dxa" w:w="6306"/>
+            <w:tcBorders>
+              <w:top w:val="single" w:color="999999" w:sz="4"/>
+              <w:left w:val="single" w:color="999999" w:sz="4"/>
+              <w:bottom w:val="single" w:color="999999" w:sz="4"/>
+              <w:right w:val="single" w:color="999999" w:sz="4"/>
+            </w:tcBorders>
+            <w:tcMar>
+              <w:top w:type="dxa" w:w="50"/>
+              <w:left w:type="dxa" w:w="80"/>
+              <w:bottom w:type="dxa" w:w="50"/>
+              <w:right w:type="dxa" w:w="80"/>
+            </w:tcMar>
+          </w:tcPr>
+          <w:p>
+            <w:r>
+              <w:rPr>
+                <w:rFonts w:ascii="Arial" w:cs="Arial" w:eastAsia="Arial" w:hAnsi="Arial"/>
+                <w:b w:val="false"/>
+                <w:bCs w:val="false"/>
+                <w:sz w:val="16"/>
+                <w:szCs w:val="16"/>
+              </w:rPr>
+              <w:t>Add a per-IP limiter on POST /api/boards before any public deployment.</w:t>
+            </w:r>
+          </w:p>
+        </w:tc>
+      </w:tr>
+      <w:tr>
+        <w:trPr>
+          <w:cantSplit/>
+        </w:trPr>
+        <w:tc>
+          <w:tcPr>
+            <w:tcW w:type="dxa" w:w="3800"/>
+            <w:tcBorders>
+              <w:top w:val="single" w:color="999999" w:sz="4"/>
+              <w:left w:val="single" w:color="999999" w:sz="4"/>
+              <w:bottom w:val="single" w:color="999999" w:sz="4"/>
+              <w:right w:val="single" w:color="999999" w:sz="4"/>
+            </w:tcBorders>
+            <w:tcMar>
+              <w:top w:type="dxa" w:w="50"/>
+              <w:left w:type="dxa" w:w="80"/>
+              <w:bottom w:type="dxa" w:w="50"/>
+              <w:right w:type="dxa" w:w="80"/>
+            </w:tcMar>
+          </w:tcPr>
+          <w:p>
+            <w:r>
+              <w:rPr>
+                <w:rFonts w:ascii="Arial" w:cs="Arial" w:eastAsia="Arial" w:hAnsi="Arial"/>
+                <w:b w:val="false"/>
+                <w:bCs w:val="false"/>
+                <w:sz w:val="16"/>
+                <w:szCs w:val="16"/>
+              </w:rPr>
+              <w:t>Tombstones are not stored: after a server restart a deleted object id could be reused by a new object.</w:t>
+            </w:r>
+          </w:p>
+        </w:tc>
+        <w:tc>
+          <w:tcPr>
+            <w:tcW w:type="dxa" w:w="6306"/>
+            <w:tcBorders>
+              <w:top w:val="single" w:color="999999" w:sz="4"/>
+              <w:left w:val="single" w:color="999999" w:sz="4"/>
+              <w:bottom w:val="single" w:color="999999" w:sz="4"/>
+              <w:right w:val="single" w:color="999999" w:sz="4"/>
+            </w:tcBorders>
+            <w:tcMar>
+              <w:top w:type="dxa" w:w="50"/>
+              <w:left w:type="dxa" w:w="80"/>
+              <w:bottom w:type="dxa" w:w="50"/>
+              <w:right w:type="dxa" w:w="80"/>
+            </w:tcMar>
+          </w:tcPr>
+          <w:p>
+            <w:r>
+              <w:rPr>
+                <w:rFonts w:ascii="Arial" w:cs="Arial" w:eastAsia="Arial" w:hAnsi="Arial"/>
+                <w:b w:val="false"/>
+                <w:bCs w:val="false"/>
+                <w:sz w:val="16"/>
+                <w:szCs w:val="16"/>
+              </w:rPr>
+              <w:t>Accepted for now (ids are client-generated random values); store deletes as tombstones if it ever matters.</w:t>
+            </w:r>
+          </w:p>
+        </w:tc>
+      </w:tr>
+      <w:tr>
+        <w:trPr>
+          <w:cantSplit/>
+        </w:trPr>
+        <w:tc>
+          <w:tcPr>
+            <w:tcW w:type="dxa" w:w="3800"/>
+            <w:tcBorders>
+              <w:top w:val="single" w:color="999999" w:sz="4"/>
+              <w:left w:val="single" w:color="999999" w:sz="4"/>
+              <w:bottom w:val="single" w:color="999999" w:sz="4"/>
+              <w:right w:val="single" w:color="999999" w:sz="4"/>
+            </w:tcBorders>
+            <w:tcMar>
+              <w:top w:type="dxa" w:w="50"/>
+              <w:left w:type="dxa" w:w="80"/>
+              <w:bottom w:type="dxa" w:w="50"/>
+              <w:right w:type="dxa" w:w="80"/>
+            </w:tcMar>
+          </w:tcPr>
+          <w:p>
+            <w:r>
+              <w:rPr>
+                <w:rFonts w:ascii="Arial" w:cs="Arial" w:eastAsia="Arial" w:hAnsi="Arial"/>
+                <w:b w:val="false"/>
+                <w:bCs w:val="false"/>
+                <w:sz w:val="16"/>
+                <w:szCs w:val="16"/>
+              </w:rPr>
+              <w:t>Background saving can lose the last few milliseconds of operations on a crash.</w:t>
+            </w:r>
+          </w:p>
+        </w:tc>
+        <w:tc>
+          <w:tcPr>
+            <w:tcW w:type="dxa" w:w="6306"/>
+            <w:tcBorders>
+              <w:top w:val="single" w:color="999999" w:sz="4"/>
+              <w:left w:val="single" w:color="999999" w:sz="4"/>
+              <w:bottom w:val="single" w:color="999999" w:sz="4"/>
+              <w:right w:val="single" w:color="999999" w:sz="4"/>
+            </w:tcBorders>
+            <w:tcMar>
+              <w:top w:type="dxa" w:w="50"/>
+              <w:left w:type="dxa" w:w="80"/>
+              <w:bottom w:type="dxa" w:w="50"/>
+              <w:right w:type="dxa" w:w="80"/>
+            </w:tcMar>
+          </w:tcPr>
+          <w:p>
+            <w:r>
+              <w:rPr>
+                <w:rFonts w:ascii="Arial" w:cs="Arial" w:eastAsia="Arial" w:hAnsi="Arial"/>
+                <w:b w:val="false"/>
+                <w:bCs w:val="false"/>
+                <w:sz w:val="16"/>
+                <w:szCs w:val="16"/>
+              </w:rPr>
+              <w:t>Accepted trade-off for latency; queue is flushed on normal shutdown. Revisit if durability needs to be stricter.</w:t>
             </w:r>
           </w:p>
         </w:tc>

</xml_diff>